<commit_message>
added routes for other pages
</commit_message>
<xml_diff>
--- a/documentation/assest log.docx
+++ b/documentation/assest log.docx
@@ -12,6 +12,20 @@
             <w:rStyle w:val="Hyperlink"/>
           </w:rPr>
           <w:t>Get started with Bootstrap · Bootstrap v5.3</w:t>
+        </w:r>
+      </w:hyperlink>
+    </w:p>
+    <w:p/>
+    <w:p>
+      <w:r>
+        <w:t xml:space="preserve">Footer code was from </w:t>
+      </w:r>
+      <w:hyperlink r:id="rId5" w:history="1">
+        <w:r>
+          <w:rPr>
+            <w:rStyle w:val="Hyperlink"/>
+          </w:rPr>
+          <w:t>stylish footer</w:t>
         </w:r>
       </w:hyperlink>
     </w:p>

</xml_diff>

<commit_message>
Add terms and conditions page and update asset log with licensing information
</commit_message>
<xml_diff>
--- a/documentation/assest log.docx
+++ b/documentation/assest log.docx
@@ -3,10 +3,33 @@
 <w:document xmlns:wpc="http://schemas.microsoft.com/office/word/2010/wordprocessingCanvas" xmlns:cx="http://schemas.microsoft.com/office/drawing/2014/chartex" xmlns:cx1="http://schemas.microsoft.com/office/drawing/2015/9/8/chartex" xmlns:cx2="http://schemas.microsoft.com/office/drawing/2015/10/21/chartex" xmlns:cx3="http://schemas.microsoft.com/office/drawing/2016/5/9/chartex" xmlns:cx4="http://schemas.microsoft.com/office/drawing/2016/5/10/chartex" xmlns:cx5="http://schemas.microsoft.com/office/drawing/2016/5/11/chartex" xmlns:cx6="http://schemas.microsoft.com/office/drawing/2016/5/12/chartex" xmlns:cx7="http://schemas.microsoft.com/office/drawing/2016/5/13/chartex" xmlns:cx8="http://schemas.microsoft.com/office/drawing/2016/5/14/chartex" xmlns:mc="http://schemas.openxmlformats.org/markup-compatibility/2006" xmlns:aink="http://schemas.microsoft.com/office/drawing/2016/ink" xmlns:am3d="http://schemas.microsoft.com/office/drawing/2017/model3d" xmlns:o="urn:schemas-microsoft-com:office:office" xmlns:oel="http://schemas.microsoft.com/office/2019/extlst" xmlns:r="http://schemas.openxmlformats.org/officeDocument/2006/relationships" xmlns:m="http://schemas.openxmlformats.org/officeDocument/2006/math" xmlns:v="urn:schemas-microsoft-com:vml" xmlns:wp14="http://schemas.microsoft.com/office/word/2010/wordprocessingDrawing" xmlns:wp="http://schemas.openxmlformats.org/drawingml/2006/wordprocessingDrawing" xmlns:w10="urn:schemas-microsoft-com:office:word" xmlns:w="http://schemas.openxmlformats.org/wordprocessingml/2006/main" xmlns:w14="http://schemas.microsoft.com/office/word/2010/wordml" xmlns:w15="http://schemas.microsoft.com/office/word/2012/wordml" xmlns:w16cex="http://schemas.microsoft.com/office/word/2018/wordml/cex" xmlns:w16cid="http://schemas.microsoft.com/office/word/2016/wordml/cid" xmlns:w16="http://schemas.microsoft.com/office/word/2018/wordml" xmlns:w16du="http://schemas.microsoft.com/office/word/2023/wordml/word16du" xmlns:w16sdtdh="http://schemas.microsoft.com/office/word/2020/wordml/sdtdatahash" xmlns:w16sdtfl="http://schemas.microsoft.com/office/word/2024/wordml/sdtformatlock" xmlns:w16se="http://schemas.microsoft.com/office/word/2015/wordml/symex" xmlns:wpg="http://schemas.microsoft.com/office/word/2010/wordprocessingGroup" xmlns:wpi="http://schemas.microsoft.com/office/word/2010/wordprocessingInk" xmlns:wne="http://schemas.microsoft.com/office/word/2006/wordml" xmlns:wps="http://schemas.microsoft.com/office/word/2010/wordprocessingShape" mc:Ignorable="w14 w15 w16se w16cid w16 w16cex w16sdtdh w16sdtfl w16du wp14">
   <w:body>
     <w:p>
-      <w:r>
-        <w:t xml:space="preserve">Bootstrap code was gotten of  </w:t>
-      </w:r>
-      <w:hyperlink r:id="rId4" w:history="1">
+      <w:pPr>
+        <w:pStyle w:val="Heading1"/>
+      </w:pPr>
+      <w:r>
+        <w:t>Bootstrap</w:t>
+      </w:r>
+    </w:p>
+    <w:p>
+      <w:r>
+        <w:t xml:space="preserve">Various misalliance pieces of </w:t>
+      </w:r>
+      <w:r>
+        <w:t xml:space="preserve">Bootstrap code was gotten </w:t>
+      </w:r>
+      <w:r>
+        <w:t xml:space="preserve"> from the following </w:t>
+      </w:r>
+    </w:p>
+    <w:p>
+      <w:pPr>
+        <w:pStyle w:val="ListParagraph"/>
+        <w:numPr>
+          <w:ilvl w:val="0"/>
+          <w:numId w:val="1"/>
+        </w:numPr>
+      </w:pPr>
+      <w:hyperlink r:id="rId5" w:history="1">
         <w:r>
           <w:rPr>
             <w:rStyle w:val="Hyperlink"/>
@@ -15,30 +38,326 @@
         </w:r>
       </w:hyperlink>
     </w:p>
+    <w:p>
+      <w:pPr>
+        <w:pStyle w:val="ListParagraph"/>
+        <w:numPr>
+          <w:ilvl w:val="0"/>
+          <w:numId w:val="1"/>
+        </w:numPr>
+      </w:pPr>
+      <w:hyperlink r:id="rId6" w:history="1">
+        <w:r>
+          <w:rPr>
+            <w:rStyle w:val="Hyperlink"/>
+          </w:rPr>
+          <w:t>Position · Bootstrap v5.0</w:t>
+        </w:r>
+      </w:hyperlink>
+    </w:p>
+    <w:p>
+      <w:pPr>
+        <w:pStyle w:val="ListParagraph"/>
+        <w:numPr>
+          <w:ilvl w:val="0"/>
+          <w:numId w:val="1"/>
+        </w:numPr>
+      </w:pPr>
+      <w:hyperlink r:id="rId7" w:history="1">
+        <w:r>
+          <w:rPr>
+            <w:rStyle w:val="Hyperlink"/>
+          </w:rPr>
+          <w:t>Colors · Bootstrap</w:t>
+        </w:r>
+      </w:hyperlink>
+    </w:p>
+    <w:p>
+      <w:pPr>
+        <w:pStyle w:val="ListParagraph"/>
+        <w:numPr>
+          <w:ilvl w:val="0"/>
+          <w:numId w:val="1"/>
+        </w:numPr>
+      </w:pPr>
+      <w:hyperlink r:id="rId8" w:history="1">
+        <w:r>
+          <w:rPr>
+            <w:rStyle w:val="Hyperlink"/>
+          </w:rPr>
+          <w:t>Background · Bootstrap v5.0</w:t>
+        </w:r>
+      </w:hyperlink>
+    </w:p>
+    <w:p>
+      <w:pPr>
+        <w:pStyle w:val="ListParagraph"/>
+        <w:numPr>
+          <w:ilvl w:val="0"/>
+          <w:numId w:val="1"/>
+        </w:numPr>
+      </w:pPr>
+      <w:hyperlink r:id="rId9" w:history="1">
+        <w:r>
+          <w:rPr>
+            <w:rStyle w:val="Hyperlink"/>
+          </w:rPr>
+          <w:t>Sizing · Bootstrap</w:t>
+        </w:r>
+      </w:hyperlink>
+    </w:p>
+    <w:p>
+      <w:pPr>
+        <w:pStyle w:val="ListParagraph"/>
+        <w:numPr>
+          <w:ilvl w:val="0"/>
+          <w:numId w:val="1"/>
+        </w:numPr>
+      </w:pPr>
+      <w:hyperlink r:id="rId10" w:history="1">
+        <w:r>
+          <w:rPr>
+            <w:rStyle w:val="Hyperlink"/>
+          </w:rPr>
+          <w:t>Text · Bootstrap v5.0</w:t>
+        </w:r>
+      </w:hyperlink>
+    </w:p>
+    <w:p>
+      <w:pPr>
+        <w:pStyle w:val="Heading1"/>
+      </w:pPr>
+      <w:r>
+        <w:t>Pattens</w:t>
+      </w:r>
+    </w:p>
+    <w:p>
+      <w:r>
+        <w:t xml:space="preserve">The </w:t>
+      </w:r>
+      <w:r>
+        <w:t>various patterns on pages where f</w:t>
+      </w:r>
+      <w:r>
+        <w:t>rom</w:t>
+      </w:r>
+      <w:r>
+        <w:t xml:space="preserve"> </w:t>
+      </w:r>
+      <w:hyperlink r:id="rId11" w:history="1">
+        <w:r>
+          <w:rPr>
+            <w:rStyle w:val="Hyperlink"/>
+          </w:rPr>
+          <w:t>Future Patterns | Figma</w:t>
+        </w:r>
+      </w:hyperlink>
+      <w:r>
+        <w:t xml:space="preserve"> </w:t>
+      </w:r>
+      <w:r>
+        <w:t xml:space="preserve">licenced under the </w:t>
+      </w:r>
+      <w:hyperlink r:id="rId12" w:history="1">
+        <w:r>
+          <w:rPr>
+            <w:rStyle w:val="Hyperlink"/>
+          </w:rPr>
+          <w:t>CC BY 4.0</w:t>
+        </w:r>
+      </w:hyperlink>
+      <w:r>
+        <w:t xml:space="preserve"> </w:t>
+      </w:r>
+      <w:r>
+        <w:t>which is a open source license</w:t>
+      </w:r>
+    </w:p>
+    <w:p>
+      <w:pPr>
+        <w:pStyle w:val="Heading1"/>
+      </w:pPr>
+      <w:r>
+        <w:t>Images</w:t>
+      </w:r>
+    </w:p>
+    <w:p>
+      <w:r>
+        <w:t>All images that where used where stock images found through google images with the search “stock {what I wanted} image”</w:t>
+      </w:r>
+    </w:p>
+    <w:p>
+      <w:pPr>
+        <w:pStyle w:val="Heading1"/>
+      </w:pPr>
+      <w:r>
+        <w:t>Icons</w:t>
+      </w:r>
+    </w:p>
+    <w:p>
+      <w:pPr>
+        <w:pStyle w:val="Heading2"/>
+      </w:pPr>
+      <w:r>
+        <w:t>Icon duck items:</w:t>
+      </w:r>
+    </w:p>
+    <w:p>
+      <w:r>
+        <w:t xml:space="preserve">plug - </w:t>
+      </w:r>
+      <w:r>
+        <w:t>Apache License 2.0</w:t>
+      </w:r>
+    </w:p>
     <w:p/>
+    <w:p>
+      <w:r>
+        <w:t>Akar Icons – Icon Set – Iconduck</w:t>
+      </w:r>
+      <w:r>
+        <w:t xml:space="preserve">(social media icons) licenced under the </w:t>
+      </w:r>
+      <w:hyperlink r:id="rId13" w:history="1">
+        <w:r>
+          <w:rPr>
+            <w:rStyle w:val="Hyperlink"/>
+          </w:rPr>
+          <w:t>MIT License</w:t>
+        </w:r>
+      </w:hyperlink>
+      <w:r>
+        <w:t xml:space="preserve"> </w:t>
+      </w:r>
+      <w:r>
+        <w:t>which is a open source license</w:t>
+      </w:r>
+    </w:p>
+    <w:p>
+      <w:r>
+        <w:t xml:space="preserve">Bank icon - </w:t>
+      </w:r>
+      <w:r>
+        <w:br/>
+        <w:t xml:space="preserve">rose icon are form: </w:t>
+      </w:r>
+      <w:r>
+        <w:t xml:space="preserve"> </w:t>
+      </w:r>
+      <w:hyperlink r:id="rId14" w:history="1">
+        <w:r>
+          <w:rPr>
+            <w:rStyle w:val="Hyperlink"/>
+          </w:rPr>
+          <w:t>"bank" Icon - Download for free – Iconduck</w:t>
+        </w:r>
+      </w:hyperlink>
+      <w:r>
+        <w:t xml:space="preserve"> licenced under the  </w:t>
+      </w:r>
+      <w:hyperlink r:id="rId15" w:history="1">
+        <w:r>
+          <w:rPr>
+            <w:rStyle w:val="Hyperlink"/>
+          </w:rPr>
+          <w:t>CC BY 4.0</w:t>
+        </w:r>
+      </w:hyperlink>
+    </w:p>
+    <w:p>
+      <w:r>
+        <w:br/>
+      </w:r>
+      <w:hyperlink r:id="rId16" w:history="1">
+        <w:r>
+          <w:rPr>
+            <w:rStyle w:val="Hyperlink"/>
+          </w:rPr>
+          <w:t>"rosegarden" Icon - Download for free – Iconduck</w:t>
+        </w:r>
+      </w:hyperlink>
+      <w:r>
+        <w:t xml:space="preserve"> </w:t>
+      </w:r>
+      <w:r>
+        <w:t xml:space="preserve">licenced under the </w:t>
+      </w:r>
+      <w:r>
+        <w:br/>
+      </w:r>
+      <w:r>
+        <w:rPr>
+          <w:rFonts w:ascii="Open Sans" w:hAnsi="Open Sans" w:cs="Open Sans"/>
+          <w:color w:val="000000"/>
+          <w:sz w:val="20"/>
+          <w:szCs w:val="20"/>
+          <w:shd w:val="clear" w:color="auto" w:fill="FFFFFF"/>
+        </w:rPr>
+        <w:t>GNU General Public License v3.0</w:t>
+      </w:r>
+      <w:r>
+        <w:rPr>
+          <w:rFonts w:ascii="Open Sans" w:hAnsi="Open Sans" w:cs="Open Sans"/>
+          <w:color w:val="000000"/>
+          <w:sz w:val="20"/>
+          <w:szCs w:val="20"/>
+          <w:shd w:val="clear" w:color="auto" w:fill="FFFFFF"/>
+        </w:rPr>
+        <w:t xml:space="preserve"> </w:t>
+      </w:r>
+      <w:r>
+        <w:t>which is a open source license</w:t>
+      </w:r>
+    </w:p>
     <w:p/>
     <w:p>
-      <w:proofErr w:type="gramStart"/>
-      <w:r>
-        <w:t>Icons :</w:t>
-      </w:r>
-      <w:proofErr w:type="gramEnd"/>
-    </w:p>
-    <w:p>
-      <w:pPr>
-        <w:ind w:firstLine="720"/>
-      </w:pPr>
-      <w:r>
-        <w:t xml:space="preserve">plug - </w:t>
-      </w:r>
-      <w:r>
-        <w:t>Apache License 2.0</w:t>
-      </w:r>
-    </w:p>
-    <w:p>
-      <w:pPr>
-        <w:ind w:firstLine="720"/>
-      </w:pPr>
+      <w:pPr>
+        <w:pStyle w:val="Heading1"/>
+      </w:pPr>
+      <w:r>
+        <w:lastRenderedPageBreak/>
+        <w:t>other</w:t>
+      </w:r>
+    </w:p>
+    <w:p>
+      <w:pPr>
+        <w:rPr>
+          <w:color w:val="156082" w:themeColor="accent1"/>
+        </w:rPr>
+      </w:pPr>
+      <w:r>
+        <w:t>drop down</w:t>
+      </w:r>
+      <w:r>
+        <w:t xml:space="preserve"> </w:t>
+      </w:r>
+      <w:r>
+        <w:t xml:space="preserve">, filter off </w:t>
+      </w:r>
+      <w:r>
+        <w:t xml:space="preserve">and leaf </w:t>
+      </w:r>
+      <w:r>
+        <w:t>icon</w:t>
+      </w:r>
+      <w:r>
+        <w:t>’s</w:t>
+      </w:r>
+      <w:r>
+        <w:t xml:space="preserve"> from </w:t>
+      </w:r>
+      <w:r>
+        <w:br/>
+        <w:t xml:space="preserve">cool icons free icon set licenced under the </w:t>
+      </w:r>
+      <w:hyperlink r:id="rId17" w:history="1">
+        <w:r>
+          <w:rPr>
+            <w:color w:val="156082" w:themeColor="accent1"/>
+          </w:rPr>
+          <w:t>CC BY 4.0</w:t>
+        </w:r>
+      </w:hyperlink>
     </w:p>
     <w:p/>
     <w:sectPr>
@@ -49,6 +368,127 @@
     </w:sectPr>
   </w:body>
 </w:document>
+</file>
+
+<file path=word/numbering.xml><?xml version="1.0" encoding="utf-8"?>
+<w:numbering xmlns:wpc="http://schemas.microsoft.com/office/word/2010/wordprocessingCanvas" xmlns:cx="http://schemas.microsoft.com/office/drawing/2014/chartex" xmlns:cx1="http://schemas.microsoft.com/office/drawing/2015/9/8/chartex" xmlns:cx2="http://schemas.microsoft.com/office/drawing/2015/10/21/chartex" xmlns:cx3="http://schemas.microsoft.com/office/drawing/2016/5/9/chartex" xmlns:cx4="http://schemas.microsoft.com/office/drawing/2016/5/10/chartex" xmlns:cx5="http://schemas.microsoft.com/office/drawing/2016/5/11/chartex" xmlns:cx6="http://schemas.microsoft.com/office/drawing/2016/5/12/chartex" xmlns:cx7="http://schemas.microsoft.com/office/drawing/2016/5/13/chartex" xmlns:cx8="http://schemas.microsoft.com/office/drawing/2016/5/14/chartex" xmlns:mc="http://schemas.openxmlformats.org/markup-compatibility/2006" xmlns:aink="http://schemas.microsoft.com/office/drawing/2016/ink" xmlns:am3d="http://schemas.microsoft.com/office/drawing/2017/model3d" xmlns:o="urn:schemas-microsoft-com:office:office" xmlns:oel="http://schemas.microsoft.com/office/2019/extlst" xmlns:r="http://schemas.openxmlformats.org/officeDocument/2006/relationships" xmlns:m="http://schemas.openxmlformats.org/officeDocument/2006/math" xmlns:v="urn:schemas-microsoft-com:vml" xmlns:wp14="http://schemas.microsoft.com/office/word/2010/wordprocessingDrawing" xmlns:wp="http://schemas.openxmlformats.org/drawingml/2006/wordprocessingDrawing" xmlns:w10="urn:schemas-microsoft-com:office:word" xmlns:w="http://schemas.openxmlformats.org/wordprocessingml/2006/main" xmlns:w14="http://schemas.microsoft.com/office/word/2010/wordml" xmlns:w15="http://schemas.microsoft.com/office/word/2012/wordml" xmlns:w16cex="http://schemas.microsoft.com/office/word/2018/wordml/cex" xmlns:w16cid="http://schemas.microsoft.com/office/word/2016/wordml/cid" xmlns:w16="http://schemas.microsoft.com/office/word/2018/wordml" xmlns:w16du="http://schemas.microsoft.com/office/word/2023/wordml/word16du" xmlns:w16sdtdh="http://schemas.microsoft.com/office/word/2020/wordml/sdtdatahash" xmlns:w16sdtfl="http://schemas.microsoft.com/office/word/2024/wordml/sdtformatlock" xmlns:w16se="http://schemas.microsoft.com/office/word/2015/wordml/symex" xmlns:wpg="http://schemas.microsoft.com/office/word/2010/wordprocessingGroup" xmlns:wpi="http://schemas.microsoft.com/office/word/2010/wordprocessingInk" xmlns:wne="http://schemas.microsoft.com/office/word/2006/wordml" xmlns:wps="http://schemas.microsoft.com/office/word/2010/wordprocessingShape" mc:Ignorable="w14 w15 w16se w16cid w16 w16cex w16sdtdh w16sdtfl w16du wp14">
+  <w:abstractNum w:abstractNumId="0" w15:restartNumberingAfterBreak="0">
+    <w:nsid w:val="4093052E"/>
+    <w:multiLevelType w:val="hybridMultilevel"/>
+    <w:tmpl w:val="E2961B36"/>
+    <w:lvl w:ilvl="0" w:tplc="08090001">
+      <w:start w:val="1"/>
+      <w:numFmt w:val="bullet"/>
+      <w:lvlText w:val=""/>
+      <w:lvlJc w:val="left"/>
+      <w:pPr>
+        <w:ind w:left="720" w:hanging="360"/>
+      </w:pPr>
+      <w:rPr>
+        <w:rFonts w:ascii="Symbol" w:hAnsi="Symbol" w:hint="default"/>
+      </w:rPr>
+    </w:lvl>
+    <w:lvl w:ilvl="1" w:tplc="08090003" w:tentative="1">
+      <w:start w:val="1"/>
+      <w:numFmt w:val="bullet"/>
+      <w:lvlText w:val="o"/>
+      <w:lvlJc w:val="left"/>
+      <w:pPr>
+        <w:ind w:left="1440" w:hanging="360"/>
+      </w:pPr>
+      <w:rPr>
+        <w:rFonts w:ascii="Courier New" w:hAnsi="Courier New" w:cs="Courier New" w:hint="default"/>
+      </w:rPr>
+    </w:lvl>
+    <w:lvl w:ilvl="2" w:tplc="08090005" w:tentative="1">
+      <w:start w:val="1"/>
+      <w:numFmt w:val="bullet"/>
+      <w:lvlText w:val=""/>
+      <w:lvlJc w:val="left"/>
+      <w:pPr>
+        <w:ind w:left="2160" w:hanging="360"/>
+      </w:pPr>
+      <w:rPr>
+        <w:rFonts w:ascii="Wingdings" w:hAnsi="Wingdings" w:hint="default"/>
+      </w:rPr>
+    </w:lvl>
+    <w:lvl w:ilvl="3" w:tplc="08090001" w:tentative="1">
+      <w:start w:val="1"/>
+      <w:numFmt w:val="bullet"/>
+      <w:lvlText w:val=""/>
+      <w:lvlJc w:val="left"/>
+      <w:pPr>
+        <w:ind w:left="2880" w:hanging="360"/>
+      </w:pPr>
+      <w:rPr>
+        <w:rFonts w:ascii="Symbol" w:hAnsi="Symbol" w:hint="default"/>
+      </w:rPr>
+    </w:lvl>
+    <w:lvl w:ilvl="4" w:tplc="08090003" w:tentative="1">
+      <w:start w:val="1"/>
+      <w:numFmt w:val="bullet"/>
+      <w:lvlText w:val="o"/>
+      <w:lvlJc w:val="left"/>
+      <w:pPr>
+        <w:ind w:left="3600" w:hanging="360"/>
+      </w:pPr>
+      <w:rPr>
+        <w:rFonts w:ascii="Courier New" w:hAnsi="Courier New" w:cs="Courier New" w:hint="default"/>
+      </w:rPr>
+    </w:lvl>
+    <w:lvl w:ilvl="5" w:tplc="08090005" w:tentative="1">
+      <w:start w:val="1"/>
+      <w:numFmt w:val="bullet"/>
+      <w:lvlText w:val=""/>
+      <w:lvlJc w:val="left"/>
+      <w:pPr>
+        <w:ind w:left="4320" w:hanging="360"/>
+      </w:pPr>
+      <w:rPr>
+        <w:rFonts w:ascii="Wingdings" w:hAnsi="Wingdings" w:hint="default"/>
+      </w:rPr>
+    </w:lvl>
+    <w:lvl w:ilvl="6" w:tplc="08090001" w:tentative="1">
+      <w:start w:val="1"/>
+      <w:numFmt w:val="bullet"/>
+      <w:lvlText w:val=""/>
+      <w:lvlJc w:val="left"/>
+      <w:pPr>
+        <w:ind w:left="5040" w:hanging="360"/>
+      </w:pPr>
+      <w:rPr>
+        <w:rFonts w:ascii="Symbol" w:hAnsi="Symbol" w:hint="default"/>
+      </w:rPr>
+    </w:lvl>
+    <w:lvl w:ilvl="7" w:tplc="08090003" w:tentative="1">
+      <w:start w:val="1"/>
+      <w:numFmt w:val="bullet"/>
+      <w:lvlText w:val="o"/>
+      <w:lvlJc w:val="left"/>
+      <w:pPr>
+        <w:ind w:left="5760" w:hanging="360"/>
+      </w:pPr>
+      <w:rPr>
+        <w:rFonts w:ascii="Courier New" w:hAnsi="Courier New" w:cs="Courier New" w:hint="default"/>
+      </w:rPr>
+    </w:lvl>
+    <w:lvl w:ilvl="8" w:tplc="08090005" w:tentative="1">
+      <w:start w:val="1"/>
+      <w:numFmt w:val="bullet"/>
+      <w:lvlText w:val=""/>
+      <w:lvlJc w:val="left"/>
+      <w:pPr>
+        <w:ind w:left="6480" w:hanging="360"/>
+      </w:pPr>
+      <w:rPr>
+        <w:rFonts w:ascii="Wingdings" w:hAnsi="Wingdings" w:hint="default"/>
+      </w:rPr>
+    </w:lvl>
+  </w:abstractNum>
+  <w:num w:numId="1" w16cid:durableId="570584132">
+    <w:abstractNumId w:val="0"/>
+  </w:num>
+</w:numbering>
 </file>
 
 <file path=word/styles.xml><?xml version="1.0" encoding="utf-8"?>
@@ -451,6 +891,7 @@
   <w:style w:type="paragraph" w:default="1" w:styleId="Normal">
     <w:name w:val="Normal"/>
     <w:qFormat/>
+    <w:rsid w:val="008A45F0"/>
   </w:style>
   <w:style w:type="paragraph" w:styleId="Heading1">
     <w:name w:val="heading 1"/>
@@ -479,7 +920,6 @@
     <w:next w:val="Normal"/>
     <w:link w:val="Heading2Char"/>
     <w:uiPriority w:val="9"/>
-    <w:semiHidden/>
     <w:unhideWhenUsed/>
     <w:qFormat/>
     <w:rsid w:val="006742DB"/>
@@ -695,7 +1135,6 @@
     <w:basedOn w:val="DefaultParagraphFont"/>
     <w:link w:val="Heading2"/>
     <w:uiPriority w:val="9"/>
-    <w:semiHidden/>
     <w:rsid w:val="006742DB"/>
     <w:rPr>
       <w:rFonts w:asciiTheme="majorHAnsi" w:eastAsiaTheme="majorEastAsia" w:hAnsiTheme="majorHAnsi" w:cstheme="majorBidi"/>
@@ -989,6 +1428,15 @@
       <w:color w:val="605E5C"/>
       <w:shd w:val="clear" w:color="auto" w:fill="E1DFDD"/>
     </w:rPr>
+  </w:style>
+  <w:style w:type="paragraph" w:styleId="NoSpacing">
+    <w:name w:val="No Spacing"/>
+    <w:uiPriority w:val="1"/>
+    <w:qFormat/>
+    <w:rsid w:val="008A45F0"/>
+    <w:pPr>
+      <w:spacing w:after="0" w:line="240" w:lineRule="auto"/>
+    </w:pPr>
   </w:style>
 </w:styles>
 </file>

</xml_diff>

<commit_message>
re-added compleated html files and edited choice of images
</commit_message>
<xml_diff>
--- a/documentation/assest log.docx
+++ b/documentation/assest log.docx
@@ -167,10 +167,7 @@
         </w:r>
       </w:hyperlink>
       <w:r>
-        <w:t xml:space="preserve"> </w:t>
-      </w:r>
-      <w:r>
-        <w:t>which is a open source license</w:t>
+        <w:t xml:space="preserve"> which is a open source license</w:t>
       </w:r>
     </w:p>
     <w:p>
@@ -227,10 +224,7 @@
         </w:r>
       </w:hyperlink>
       <w:r>
-        <w:t xml:space="preserve"> </w:t>
-      </w:r>
-      <w:r>
-        <w:t>which is a open source license</w:t>
+        <w:t xml:space="preserve"> which is a open source license</w:t>
       </w:r>
     </w:p>
     <w:p>
@@ -293,38 +287,52 @@
           <w:szCs w:val="20"/>
           <w:shd w:val="clear" w:color="auto" w:fill="FFFFFF"/>
         </w:rPr>
-        <w:t>GNU General Public License v3.0</w:t>
-      </w:r>
-      <w:r>
-        <w:rPr>
-          <w:rFonts w:ascii="Open Sans" w:hAnsi="Open Sans" w:cs="Open Sans"/>
-          <w:color w:val="000000"/>
-          <w:sz w:val="20"/>
-          <w:szCs w:val="20"/>
-          <w:shd w:val="clear" w:color="auto" w:fill="FFFFFF"/>
-        </w:rPr>
-        <w:t xml:space="preserve"> </w:t>
+        <w:t xml:space="preserve">GNU General Public License v3.0 </w:t>
       </w:r>
       <w:r>
         <w:t>which is a open source license</w:t>
       </w:r>
     </w:p>
-    <w:p/>
+    <w:p>
+      <w:pPr>
+        <w:pStyle w:val="Heading2"/>
+      </w:pPr>
+      <w:r>
+        <w:lastRenderedPageBreak/>
+        <w:t>Article images</w:t>
+      </w:r>
+    </w:p>
+    <w:p>
+      <w:r>
+        <w:t>The Paris icon was generated using copilot I asked for “</w:t>
+      </w:r>
+      <w:r>
+        <w:t>can you make a green tech themed paris icon</w:t>
+      </w:r>
+      <w:r>
+        <w:t>”</w:t>
+      </w:r>
+    </w:p>
     <w:p>
       <w:pPr>
         <w:pStyle w:val="Heading1"/>
       </w:pPr>
       <w:r>
-        <w:lastRenderedPageBreak/>
-        <w:t>other</w:t>
-      </w:r>
-    </w:p>
-    <w:p>
-      <w:pPr>
-        <w:rPr>
-          <w:color w:val="156082" w:themeColor="accent1"/>
-        </w:rPr>
-      </w:pPr>
+        <w:t>O</w:t>
+      </w:r>
+      <w:r>
+        <w:t>ther</w:t>
+      </w:r>
+    </w:p>
+    <w:p>
+      <w:pPr>
+        <w:pStyle w:val="Heading2"/>
+      </w:pPr>
+      <w:r>
+        <w:t>Misc icons</w:t>
+      </w:r>
+    </w:p>
+    <w:p>
       <w:r>
         <w:t>drop down</w:t>
       </w:r>
@@ -359,7 +367,73 @@
         </w:r>
       </w:hyperlink>
     </w:p>
-    <w:p/>
+    <w:p>
+      <w:pPr>
+        <w:pStyle w:val="Heading2"/>
+      </w:pPr>
+      <w:r>
+        <w:t>flags</w:t>
+      </w:r>
+    </w:p>
+    <w:p>
+      <w:r>
+        <w:t>images of the flags</w:t>
+      </w:r>
+      <w:r>
+        <w:t xml:space="preserve"> are</w:t>
+      </w:r>
+      <w:r>
+        <w:t xml:space="preserve"> from </w:t>
+      </w:r>
+      <w:hyperlink r:id="rId18" w:history="1">
+        <w:r>
+          <w:rPr>
+            <w:rStyle w:val="Hyperlink"/>
+          </w:rPr>
+          <w:t>https://flagpedia.net/</w:t>
+        </w:r>
+      </w:hyperlink>
+      <w:r>
+        <w:t xml:space="preserve"> </w:t>
+      </w:r>
+      <w:r>
+        <w:drawing>
+          <wp:inline distT="0" distB="0" distL="0" distR="0" wp14:anchorId="016FE062" wp14:editId="5CDA9439">
+            <wp:extent cx="5687219" cy="1971950"/>
+            <wp:effectExtent l="0" t="0" r="8890" b="9525"/>
+            <wp:docPr id="1909866569" name="Picture 1" descr="A screenshot of a web page&#10;&#10;AI-generated content may be incorrect."/>
+            <wp:cNvGraphicFramePr>
+              <a:graphicFrameLocks xmlns:a="http://schemas.openxmlformats.org/drawingml/2006/main" noChangeAspect="1"/>
+            </wp:cNvGraphicFramePr>
+            <a:graphic xmlns:a="http://schemas.openxmlformats.org/drawingml/2006/main">
+              <a:graphicData uri="http://schemas.openxmlformats.org/drawingml/2006/picture">
+                <pic:pic xmlns:pic="http://schemas.openxmlformats.org/drawingml/2006/picture">
+                  <pic:nvPicPr>
+                    <pic:cNvPr id="1909866569" name="Picture 1" descr="A screenshot of a web page&#10;&#10;AI-generated content may be incorrect."/>
+                    <pic:cNvPicPr/>
+                  </pic:nvPicPr>
+                  <pic:blipFill>
+                    <a:blip r:embed="rId19"/>
+                    <a:stretch>
+                      <a:fillRect/>
+                    </a:stretch>
+                  </pic:blipFill>
+                  <pic:spPr>
+                    <a:xfrm>
+                      <a:off x="0" y="0"/>
+                      <a:ext cx="5687219" cy="1971950"/>
+                    </a:xfrm>
+                    <a:prstGeom prst="rect">
+                      <a:avLst/>
+                    </a:prstGeom>
+                  </pic:spPr>
+                </pic:pic>
+              </a:graphicData>
+            </a:graphic>
+          </wp:inline>
+        </w:drawing>
+      </w:r>
+    </w:p>
     <w:sectPr>
       <w:pgSz w:w="11906" w:h="16838"/>
       <w:pgMar w:top="1440" w:right="1440" w:bottom="1440" w:left="1440" w:header="708" w:footer="708" w:gutter="0"/>

</xml_diff>

<commit_message>
Fix typos and improve wording in documentation; update styles and layout in various templates and CSS files
</commit_message>
<xml_diff>
--- a/documentation/assest log.docx
+++ b/documentation/assest log.docx
@@ -15,10 +15,25 @@
         <w:t xml:space="preserve">Various misalliance pieces of </w:t>
       </w:r>
       <w:r>
-        <w:t xml:space="preserve">Bootstrap code was gotten </w:t>
-      </w:r>
-      <w:r>
-        <w:t xml:space="preserve"> from the following </w:t>
+        <w:t xml:space="preserve">Bootstrap code </w:t>
+      </w:r>
+      <w:r>
+        <w:t>were</w:t>
+      </w:r>
+      <w:r>
+        <w:t xml:space="preserve"> </w:t>
+      </w:r>
+      <w:r>
+        <w:t>gotten from</w:t>
+      </w:r>
+      <w:r>
+        <w:t xml:space="preserve"> the </w:t>
+      </w:r>
+      <w:r>
+        <w:t>following.</w:t>
+      </w:r>
+      <w:r>
+        <w:t xml:space="preserve"> </w:t>
       </w:r>
     </w:p>
     <w:p>
@@ -167,7 +182,13 @@
         </w:r>
       </w:hyperlink>
       <w:r>
-        <w:t xml:space="preserve"> which is a open source license</w:t>
+        <w:t xml:space="preserve"> which is </w:t>
+      </w:r>
+      <w:r>
+        <w:t>an</w:t>
+      </w:r>
+      <w:r>
+        <w:t xml:space="preserve"> open source license</w:t>
       </w:r>
     </w:p>
     <w:p>
@@ -180,7 +201,16 @@
     </w:p>
     <w:p>
       <w:r>
-        <w:t>All images that where used where stock images found through google images with the search “stock {what I wanted} image”</w:t>
+        <w:t xml:space="preserve">All images that </w:t>
+      </w:r>
+      <w:r>
+        <w:t>were</w:t>
+      </w:r>
+      <w:r>
+        <w:t xml:space="preserve"> used where stock images found through google images with the search “stock {what I wanted} </w:t>
+      </w:r>
+      <w:r>
+        <w:t>image.”</w:t>
       </w:r>
     </w:p>
     <w:p>
@@ -224,7 +254,13 @@
         </w:r>
       </w:hyperlink>
       <w:r>
-        <w:t xml:space="preserve"> which is a open source license</w:t>
+        <w:t xml:space="preserve"> which is </w:t>
+      </w:r>
+      <w:r>
+        <w:t>an</w:t>
+      </w:r>
+      <w:r>
+        <w:t xml:space="preserve"> open source license</w:t>
       </w:r>
     </w:p>
     <w:p>
@@ -290,7 +326,22 @@
         <w:t xml:space="preserve">GNU General Public License v3.0 </w:t>
       </w:r>
       <w:r>
-        <w:t>which is a open source license</w:t>
+        <w:t xml:space="preserve">which is </w:t>
+      </w:r>
+      <w:r>
+        <w:t>an</w:t>
+      </w:r>
+      <w:r>
+        <w:t xml:space="preserve"> </w:t>
+      </w:r>
+      <w:r>
+        <w:t>open-source</w:t>
+      </w:r>
+      <w:r>
+        <w:t xml:space="preserve"> </w:t>
+      </w:r>
+      <w:r>
+        <w:t>license.</w:t>
       </w:r>
     </w:p>
     <w:p>
@@ -307,12 +358,50 @@
         <w:t>The Paris icon was generated using copilot I asked for “</w:t>
       </w:r>
       <w:r>
-        <w:t>can you make a green tech themed paris icon</w:t>
-      </w:r>
-      <w:r>
-        <w:t>”</w:t>
-      </w:r>
-    </w:p>
+        <w:t xml:space="preserve">can you make a green tech themed </w:t>
+      </w:r>
+      <w:r>
+        <w:t>Paris</w:t>
+      </w:r>
+      <w:r>
+        <w:t xml:space="preserve"> </w:t>
+      </w:r>
+      <w:r>
+        <w:t>icon</w:t>
+      </w:r>
+      <w:r>
+        <w:t>.”</w:t>
+      </w:r>
+    </w:p>
+    <w:p>
+      <w:r>
+        <w:t xml:space="preserve">The </w:t>
+      </w:r>
+      <w:proofErr w:type="gramStart"/>
+      <w:r>
+        <w:t xml:space="preserve">man </w:t>
+      </w:r>
+      <w:r>
+        <w:t xml:space="preserve"> icon</w:t>
+      </w:r>
+      <w:proofErr w:type="gramEnd"/>
+      <w:r>
+        <w:t xml:space="preserve"> was generated using copilot I asked for “</w:t>
+      </w:r>
+      <w:r>
+        <w:t xml:space="preserve">can you make a green tech themed </w:t>
+      </w:r>
+      <w:r>
+        <w:t>man</w:t>
+      </w:r>
+      <w:r>
+        <w:t xml:space="preserve"> icon</w:t>
+      </w:r>
+      <w:r>
+        <w:t>.”</w:t>
+      </w:r>
+    </w:p>
+    <w:p/>
     <w:p>
       <w:pPr>
         <w:pStyle w:val="Heading1"/>

</xml_diff>